<commit_message>
Use domestic bank details on Digital Origin invoice
Replace IBAN/BIC international transfer details with UK account
number and sort code for domestic payment.

Co-Authored-By: Claude Fable 5 <noreply@anthropic.com>
Claude-Session: https://claude.ai/code/session_01WtxpvUJ4VJ7uXYEw5g5kDg
</commit_message>
<xml_diff>
--- a/INVOICE_20260723-1_Digital_Origin_Solutions_Limited.docx
+++ b/INVOICE_20260723-1_Digital_Origin_Solutions_Limited.docx
@@ -518,7 +518,7 @@
                                   <w:szCs w:val="24"/>
                                   <w:lang w:val="en-US"/>
                                 </w:rPr>
-                                <w:t>IBAN: GB36 REVO 0099 6983 8114 86</w:t>
+                                <w:t>Account Number: 79915116</w:t>
                               </w:r>
                             </w:p>
                             <w:p>
@@ -539,28 +539,7 @@
                                   <w:szCs w:val="24"/>
                                   <w:lang w:val="en-US"/>
                                 </w:rPr>
-                                <w:t>BIC: REVOGB21</w:t>
-                              </w:r>
-                            </w:p>
-                            <w:p>
-                              <w:pPr>
-                                <w:rPr>
-                                  <w:caps/>
-                                  <w:color w:val="156082" w:themeColor="accent1"/>
-                                  <w:sz w:val="24"/>
-                                  <w:szCs w:val="24"/>
-                                  <w:lang w:val="en-US"/>
-                                </w:rPr>
-                              </w:pPr>
-                              <w:r>
-                                <w:rPr>
-                                  <w:caps/>
-                                  <w:color w:val="156082" w:themeColor="accent1"/>
-                                  <w:sz w:val="24"/>
-                                  <w:szCs w:val="24"/>
-                                  <w:lang w:val="en-US"/>
-                                </w:rPr>
-                                <w:t>Intermediary BIC: CHASGB2L</w:t>
+                                <w:t>Sort Code: 04-00-75</w:t>
                               </w:r>
                             </w:p>
                             <w:p>
@@ -743,7 +722,7 @@
                             <w:szCs w:val="24"/>
                             <w:lang w:val="en-US"/>
                           </w:rPr>
-                          <w:t>IBAN: GB36 REVO 0099 6983 8114 86</w:t>
+                          <w:t>Account Number: 79915116</w:t>
                         </w:r>
                       </w:p>
                       <w:p>
@@ -764,28 +743,7 @@
                             <w:szCs w:val="24"/>
                             <w:lang w:val="en-US"/>
                           </w:rPr>
-                          <w:t>BIC: REVOGB21</w:t>
-                        </w:r>
-                      </w:p>
-                      <w:p>
-                        <w:pPr>
-                          <w:rPr>
-                            <w:caps/>
-                            <w:color w:val="156082" w:themeColor="accent1"/>
-                            <w:sz w:val="24"/>
-                            <w:szCs w:val="24"/>
-                            <w:lang w:val="en-US"/>
-                          </w:rPr>
-                        </w:pPr>
-                        <w:r>
-                          <w:rPr>
-                            <w:caps/>
-                            <w:color w:val="156082" w:themeColor="accent1"/>
-                            <w:sz w:val="24"/>
-                            <w:szCs w:val="24"/>
-                            <w:lang w:val="en-US"/>
-                          </w:rPr>
-                          <w:t>Intermediary BIC: CHASGB2L</w:t>
+                          <w:t>Sort Code: 04-00-75</w:t>
                         </w:r>
                       </w:p>
                       <w:p>

</xml_diff>

<commit_message>
Switch invoice payment details to Swiss UBS account
Payment to Abatis Security Innovations and Technologies GmbH via
IBAN/BIC for international transfer; notes Swiss VAT registration.

Co-Authored-By: Claude Fable 5 <noreply@anthropic.com>
Claude-Session: https://claude.ai/code/session_01WtxpvUJ4VJ7uXYEw5g5kDg
</commit_message>
<xml_diff>
--- a/INVOICE_20260723-1_Digital_Origin_Solutions_Limited.docx
+++ b/INVOICE_20260723-1_Digital_Origin_Solutions_Limited.docx
@@ -518,7 +518,7 @@
                                   <w:szCs w:val="24"/>
                                   <w:lang w:val="en-US"/>
                                 </w:rPr>
-                                <w:t>Account Number: 79915116</w:t>
+                                <w:t>Account Name: Abatis Security Innovations and Technologies GmbH</w:t>
                               </w:r>
                             </w:p>
                             <w:p>
@@ -539,7 +539,7 @@
                                   <w:szCs w:val="24"/>
                                   <w:lang w:val="en-US"/>
                                 </w:rPr>
-                                <w:t>Sort Code: 04-00-75</w:t>
+                                <w:t>IBAN: CH81 0024 5245 6073 9160 R</w:t>
                               </w:r>
                             </w:p>
                             <w:p>
@@ -571,7 +571,7 @@
                                   <w:szCs w:val="24"/>
                                   <w:lang w:val="en-US"/>
                                 </w:rPr>
-                                <w:t>Bank: Revolut Ltd</w:t>
+                                <w:t>BIC: UBSWCHZH80A</w:t>
                               </w:r>
                             </w:p>
                             <w:p>
@@ -592,7 +592,7 @@
                                   <w:szCs w:val="24"/>
                                   <w:lang w:val="en-US"/>
                                 </w:rPr>
-                                <w:t>Bank Address: 30 South Colonnade, E14 5HX, London, UK</w:t>
+                                <w:t>Bank: UBS Switzerland AG. Registered for VAT in Switzerland.</w:t>
                               </w:r>
                             </w:p>
                           </w:txbxContent>
@@ -722,7 +722,7 @@
                             <w:szCs w:val="24"/>
                             <w:lang w:val="en-US"/>
                           </w:rPr>
-                          <w:t>Account Number: 79915116</w:t>
+                          <w:t>Account Name: Abatis Security Innovations and Technologies GmbH</w:t>
                         </w:r>
                       </w:p>
                       <w:p>
@@ -743,7 +743,7 @@
                             <w:szCs w:val="24"/>
                             <w:lang w:val="en-US"/>
                           </w:rPr>
-                          <w:t>Sort Code: 04-00-75</w:t>
+                          <w:t>IBAN: CH81 0024 5245 6073 9160 R</w:t>
                         </w:r>
                       </w:p>
                       <w:p>
@@ -775,7 +775,7 @@
                             <w:szCs w:val="24"/>
                             <w:lang w:val="en-US"/>
                           </w:rPr>
-                          <w:t>Bank: Revolut Ltd</w:t>
+                          <w:t>BIC: UBSWCHZH80A</w:t>
                         </w:r>
                       </w:p>
                       <w:p>
@@ -796,7 +796,7 @@
                             <w:szCs w:val="24"/>
                             <w:lang w:val="en-US"/>
                           </w:rPr>
-                          <w:t>Bank Address: 30 South Colonnade, E14 5HX, London, UK</w:t>
+                          <w:t>Bank: UBS Switzerland AG. Registered for VAT in Switzerland.</w:t>
                         </w:r>
                       </w:p>
                     </w:txbxContent>

</xml_diff>

<commit_message>
Remove Swiss VAT registration note from bank details
Co-Authored-By: Claude Fable 5 <noreply@anthropic.com>
Claude-Session: https://claude.ai/code/session_01WtxpvUJ4VJ7uXYEw5g5kDg
</commit_message>
<xml_diff>
--- a/INVOICE_20260723-1_Digital_Origin_Solutions_Limited.docx
+++ b/INVOICE_20260723-1_Digital_Origin_Solutions_Limited.docx
@@ -592,7 +592,7 @@
                                   <w:szCs w:val="24"/>
                                   <w:lang w:val="en-US"/>
                                 </w:rPr>
-                                <w:t>Bank: UBS Switzerland AG. Registered for VAT in Switzerland.</w:t>
+                                <w:t>Bank: UBS Switzerland AG</w:t>
                               </w:r>
                             </w:p>
                           </w:txbxContent>
@@ -796,7 +796,7 @@
                             <w:szCs w:val="24"/>
                             <w:lang w:val="en-US"/>
                           </w:rPr>
-                          <w:t>Bank: UBS Switzerland AG. Registered for VAT in Switzerland.</w:t>
+                          <w:t>Bank: UBS Switzerland AG</w:t>
                         </w:r>
                       </w:p>
                     </w:txbxContent>

</xml_diff>